<commit_message>
Remove inferred person assignments from October TODO
Co-Authored-By: Claude Opus 5.5 <noreply@anthropic.com>
Claude-Session: https://claude.ai/code/session_01XLNS5hdtXHC9WyiUQofH1n
</commit_message>
<xml_diff>
--- a/投資10月_月次会議_TODO_V0_01.docx
+++ b/投資10月_月次会議_TODO_V0_01.docx
@@ -157,7 +157,7 @@
         <w:rPr>
           <w:rFonts w:ascii="Meiryo UI" w:eastAsia="Meiryo UI" w:hAnsi="Meiryo UI" w:cs="Meiryo UI"/>
         </w:rPr>
-        <w:t>宮崎CIOイベントは招待企業を売上規模で足切りし、招待基準のガバナンスを徹底する（今回の対象外企業は長谷川さんに招待意図を確認）</w:t>
+        <w:t>宮崎CIOイベントは招待企業を売上規模で足切りし、招待基準のガバナンスを徹底する</w:t>
       </w:r>
     </w:p>
     <w:p>
@@ -205,7 +205,7 @@
         <w:rPr>
           <w:rFonts w:ascii="Meiryo UI" w:eastAsia="Meiryo UI" w:hAnsi="Meiryo UI" w:cs="Meiryo UI"/>
         </w:rPr>
-        <w:t>コーポレートサイトは業界別に事例・エキスパート・オファリングへ直接到達できる構成とし、リリース前に構成を林さんへ確認する</w:t>
+        <w:t>コーポレートサイトは業界別に事例・エキスパート・オファリングへ直接到達できる構成とし、リリース前に構成の確認を受ける</w:t>
       </w:r>
     </w:p>
     <w:p>

</xml_diff>